<commit_message>
Actualizacion de autor a Diego Fernando Caicedo Saldarriaga en evidencias AA5-EV02
</commit_message>
<xml_diff>
--- a/evidencias/GA7-220501096-AA5-EV02/Documento_Pruebas_Testing_Postman_AA5_EV02.docx
+++ b/evidencias/GA7-220501096-AA5-EV02/Documento_Pruebas_Testing_Postman_AA5_EV02.docx
@@ -79,13 +79,7 @@
         <w:jc w:val="center"/>
       </w:pPr>
       <w:r>
-        <w:rPr>
-          <w:rFonts w:ascii="Calibri" w:hAnsi="Calibri"/>
-          <w:b/>
-          <w:color w:val="282828"/>
-          <w:sz w:val="22"/>
-        </w:rPr>
-        <w:t>Aprendiz: Hernán Salazar Ospina</w:t>
+        <w:t>Aprendiz: Diego Fernando Caicedo Saldarriaga</w:t>
         <w:br/>
         <w:t>Instructor Técnico: Equipo de Desarrollo ADSO</w:t>
         <w:br/>
@@ -2819,21 +2813,7 @@
         <w:spacing w:after="120" w:line="276" w:lineRule="auto"/>
       </w:pPr>
       <w:r>
-        <w:rPr>
-          <w:rFonts w:ascii="Calibri" w:hAnsi="Calibri"/>
-          <w:b/>
-          <w:color w:val="282828"/>
-          <w:sz w:val="22"/>
-        </w:rPr>
-        <w:t xml:space="preserve">Aprendiz Responsable: </w:t>
-      </w:r>
-      <w:r>
-        <w:rPr>
-          <w:rFonts w:ascii="Calibri" w:hAnsi="Calibri"/>
-          <w:color w:val="282828"/>
-          <w:sz w:val="22"/>
-        </w:rPr>
-        <w:t>Hernán Salazar Ospina</w:t>
+        <w:t>Aprendiz Responsable: Diego Fernando Caicedo Saldarriaga</w:t>
       </w:r>
     </w:p>
     <w:p>

</xml_diff>